<commit_message>
Update documentation and inventory features
</commit_message>
<xml_diff>
--- a/docs/DecoStone Project Diary 2026-27.docx
+++ b/docs/DecoStone Project Diary 2026-27.docx
@@ -376,8 +376,23 @@
               <w:bottom w:w="60" w:type="dxa"/>
               <w:right w:w="100" w:type="dxa"/>
             </w:tcMar>
-          </w:tcPr>
-          <w:p/>
+            <w:vAlign w:val="center"/>
+          </w:tcPr>
+          <w:p>
+            <w:pPr>
+              <w:spacing w:before="0" w:after="0" w:line="252" w:lineRule="auto"/>
+              <w:jc w:val="center"/>
+            </w:pPr>
+            <w:r/>
+            <w:r>
+              <w:rPr>
+                <w:rFonts w:ascii="Times New Roman" w:hAnsi="Times New Roman"/>
+                <w:b/>
+                <w:sz w:val="26"/>
+              </w:rPr>
+              <w:t>DecoStone Material Management System (MMS)</w:t>
+            </w:r>
+          </w:p>
         </w:tc>
       </w:tr>
       <w:tr>
@@ -427,7 +442,7 @@
           <w:sz w:val="19"/>
           <w:szCs w:val="19"/>
         </w:rPr>
-        <w:t xml:space="preserve">Team / Group ID:  </w:t>
+        <w:t>Team / Group ID:  ____________________     Project Domain:  Multi-godown material inventory</w:t>
       </w:r>
       <w:r>
         <w:rPr>
@@ -435,7 +450,6 @@
           <w:sz w:val="19"/>
           <w:szCs w:val="19"/>
         </w:rPr>
-        <w:tab/>
       </w:r>
       <w:r>
         <w:rPr>
@@ -445,7 +459,6 @@
           <w:sz w:val="19"/>
           <w:szCs w:val="19"/>
         </w:rPr>
-        <w:t xml:space="preserve">     Project Domain:  </w:t>
       </w:r>
       <w:r>
         <w:rPr>
@@ -453,7 +466,6 @@
           <w:sz w:val="19"/>
           <w:szCs w:val="19"/>
         </w:rPr>
-        <w:tab/>
       </w:r>
     </w:p>
     <w:p>
@@ -10194,7 +10206,7 @@
           <w:sz w:val="19"/>
           <w:szCs w:val="19"/>
         </w:rPr>
-        <w:t xml:space="preserve">Project Title:  </w:t>
+        <w:t>Project Title:  DecoStone MMS     Team ID:  ____________________</w:t>
       </w:r>
       <w:r>
         <w:rPr>
@@ -10202,7 +10214,6 @@
           <w:sz w:val="19"/>
           <w:szCs w:val="19"/>
         </w:rPr>
-        <w:tab/>
       </w:r>
       <w:r>
         <w:rPr>
@@ -10212,7 +10223,6 @@
           <w:sz w:val="19"/>
           <w:szCs w:val="19"/>
         </w:rPr>
-        <w:t xml:space="preserve">   Team ID:  </w:t>
       </w:r>
       <w:r>
         <w:rPr>
@@ -10220,7 +10230,6 @@
           <w:sz w:val="19"/>
           <w:szCs w:val="19"/>
         </w:rPr>
-        <w:tab/>
       </w:r>
     </w:p>
     <w:tbl>
@@ -11600,7 +11609,7 @@
           <w:sz w:val="19"/>
           <w:szCs w:val="19"/>
         </w:rPr>
-        <w:t xml:space="preserve">Project Title:  </w:t>
+        <w:t>Project Title:  DecoStone MMS     Team ID:  ____________________</w:t>
       </w:r>
       <w:r>
         <w:rPr>
@@ -11608,7 +11617,6 @@
           <w:sz w:val="19"/>
           <w:szCs w:val="19"/>
         </w:rPr>
-        <w:tab/>
       </w:r>
       <w:r>
         <w:rPr>
@@ -11618,7 +11626,6 @@
           <w:sz w:val="19"/>
           <w:szCs w:val="19"/>
         </w:rPr>
-        <w:t xml:space="preserve">   Team ID:  </w:t>
       </w:r>
       <w:r>
         <w:rPr>
@@ -11626,7 +11633,6 @@
           <w:sz w:val="19"/>
           <w:szCs w:val="19"/>
         </w:rPr>
-        <w:tab/>
       </w:r>
     </w:p>
     <w:tbl>
@@ -13006,7 +13012,7 @@
           <w:sz w:val="19"/>
           <w:szCs w:val="19"/>
         </w:rPr>
-        <w:t xml:space="preserve">Project Title:  </w:t>
+        <w:t>Project Title:  DecoStone MMS     Team ID:  ____________________</w:t>
       </w:r>
       <w:r>
         <w:rPr>
@@ -13014,7 +13020,6 @@
           <w:sz w:val="19"/>
           <w:szCs w:val="19"/>
         </w:rPr>
-        <w:tab/>
       </w:r>
       <w:r>
         <w:rPr>
@@ -13024,7 +13029,6 @@
           <w:sz w:val="19"/>
           <w:szCs w:val="19"/>
         </w:rPr>
-        <w:t xml:space="preserve">   Team ID:  </w:t>
       </w:r>
       <w:r>
         <w:rPr>
@@ -13032,7 +13036,6 @@
           <w:sz w:val="19"/>
           <w:szCs w:val="19"/>
         </w:rPr>
-        <w:tab/>
       </w:r>
     </w:p>
     <w:tbl>
@@ -14412,7 +14415,7 @@
           <w:sz w:val="19"/>
           <w:szCs w:val="19"/>
         </w:rPr>
-        <w:t xml:space="preserve">Project Title:  </w:t>
+        <w:t>Project Title:  DecoStone MMS     Team ID:  ____________________</w:t>
       </w:r>
       <w:r>
         <w:rPr>
@@ -14420,7 +14423,6 @@
           <w:sz w:val="19"/>
           <w:szCs w:val="19"/>
         </w:rPr>
-        <w:tab/>
       </w:r>
       <w:r>
         <w:rPr>
@@ -14430,7 +14432,6 @@
           <w:sz w:val="19"/>
           <w:szCs w:val="19"/>
         </w:rPr>
-        <w:t xml:space="preserve">   Team ID:  </w:t>
       </w:r>
       <w:r>
         <w:rPr>
@@ -14438,7 +14439,6 @@
           <w:sz w:val="19"/>
           <w:szCs w:val="19"/>
         </w:rPr>
-        <w:tab/>
       </w:r>
     </w:p>
     <w:tbl>
@@ -15811,7 +15811,7 @@
           <w:sz w:val="19"/>
           <w:szCs w:val="19"/>
         </w:rPr>
-        <w:t xml:space="preserve">Project Title:  </w:t>
+        <w:t>Project Title:  DecoStone MMS     Team ID:  ____________________</w:t>
       </w:r>
       <w:r>
         <w:rPr>
@@ -15819,7 +15819,6 @@
           <w:sz w:val="19"/>
           <w:szCs w:val="19"/>
         </w:rPr>
-        <w:tab/>
       </w:r>
       <w:r>
         <w:rPr>
@@ -15829,7 +15828,6 @@
           <w:sz w:val="19"/>
           <w:szCs w:val="19"/>
         </w:rPr>
-        <w:t xml:space="preserve">   Team ID:  </w:t>
       </w:r>
       <w:r>
         <w:rPr>
@@ -15837,7 +15835,6 @@
           <w:sz w:val="19"/>
           <w:szCs w:val="19"/>
         </w:rPr>
-        <w:tab/>
       </w:r>
     </w:p>
     <w:tbl>
@@ -17203,7 +17200,7 @@
           <w:sz w:val="19"/>
           <w:szCs w:val="19"/>
         </w:rPr>
-        <w:t xml:space="preserve">Project Title:  </w:t>
+        <w:t>Project Title:  DecoStone MMS     Team ID:  ____________________</w:t>
       </w:r>
       <w:r>
         <w:rPr>
@@ -17211,7 +17208,6 @@
           <w:sz w:val="19"/>
           <w:szCs w:val="19"/>
         </w:rPr>
-        <w:tab/>
       </w:r>
       <w:r>
         <w:rPr>
@@ -17221,7 +17217,6 @@
           <w:sz w:val="19"/>
           <w:szCs w:val="19"/>
         </w:rPr>
-        <w:t xml:space="preserve">   Team ID:  </w:t>
       </w:r>
       <w:r>
         <w:rPr>
@@ -17229,7 +17224,6 @@
           <w:sz w:val="19"/>
           <w:szCs w:val="19"/>
         </w:rPr>
-        <w:tab/>
       </w:r>
     </w:p>
     <w:tbl>
@@ -18595,7 +18589,7 @@
           <w:sz w:val="19"/>
           <w:szCs w:val="19"/>
         </w:rPr>
-        <w:t xml:space="preserve">Project Title:  </w:t>
+        <w:t>Project Title:  DecoStone MMS     Team ID:  ____________________</w:t>
       </w:r>
       <w:r>
         <w:rPr>
@@ -18603,7 +18597,6 @@
           <w:sz w:val="19"/>
           <w:szCs w:val="19"/>
         </w:rPr>
-        <w:tab/>
       </w:r>
       <w:r>
         <w:rPr>
@@ -18613,7 +18606,6 @@
           <w:sz w:val="19"/>
           <w:szCs w:val="19"/>
         </w:rPr>
-        <w:t xml:space="preserve">   Team ID:  </w:t>
       </w:r>
       <w:r>
         <w:rPr>
@@ -18621,7 +18613,6 @@
           <w:sz w:val="19"/>
           <w:szCs w:val="19"/>
         </w:rPr>
-        <w:tab/>
       </w:r>
     </w:p>
     <w:tbl>
@@ -19989,7 +19980,7 @@
           <w:sz w:val="19"/>
           <w:szCs w:val="19"/>
         </w:rPr>
-        <w:t xml:space="preserve">Project Title:  </w:t>
+        <w:t>Project Title:  DecoStone MMS     Team ID:  ____________________</w:t>
       </w:r>
       <w:r>
         <w:rPr>
@@ -19997,7 +19988,6 @@
           <w:sz w:val="19"/>
           <w:szCs w:val="19"/>
         </w:rPr>
-        <w:tab/>
       </w:r>
       <w:r>
         <w:rPr>
@@ -20007,7 +19997,6 @@
           <w:sz w:val="19"/>
           <w:szCs w:val="19"/>
         </w:rPr>
-        <w:t xml:space="preserve">   Team ID:  </w:t>
       </w:r>
       <w:r>
         <w:rPr>
@@ -20015,7 +20004,6 @@
           <w:sz w:val="19"/>
           <w:szCs w:val="19"/>
         </w:rPr>
-        <w:tab/>
       </w:r>
     </w:p>
     <w:tbl>
@@ -22127,7 +22115,7 @@
           <w:sz w:val="19"/>
           <w:szCs w:val="19"/>
         </w:rPr>
-        <w:t xml:space="preserve">Project Title:  </w:t>
+        <w:t>Project Title:  DecoStone MMS     Team ID:  ____________________</w:t>
       </w:r>
       <w:r>
         <w:rPr>
@@ -22135,7 +22123,6 @@
           <w:sz w:val="19"/>
           <w:szCs w:val="19"/>
         </w:rPr>
-        <w:tab/>
       </w:r>
       <w:r>
         <w:rPr>
@@ -22145,7 +22132,6 @@
           <w:sz w:val="19"/>
           <w:szCs w:val="19"/>
         </w:rPr>
-        <w:t xml:space="preserve">   Team ID:  </w:t>
       </w:r>
       <w:r>
         <w:rPr>
@@ -22153,7 +22139,6 @@
           <w:sz w:val="19"/>
           <w:szCs w:val="19"/>
         </w:rPr>
-        <w:tab/>
       </w:r>
     </w:p>
     <w:tbl>
@@ -29633,7 +29618,7 @@
           <w:sz w:val="19"/>
           <w:szCs w:val="19"/>
         </w:rPr>
-        <w:t xml:space="preserve">Project Title:  </w:t>
+        <w:t>Project Title:  DecoStone MMS     Team ID:  ____________________</w:t>
       </w:r>
       <w:r>
         <w:rPr>
@@ -29641,7 +29626,6 @@
           <w:sz w:val="19"/>
           <w:szCs w:val="19"/>
         </w:rPr>
-        <w:tab/>
       </w:r>
       <w:r>
         <w:rPr>
@@ -29651,7 +29635,6 @@
           <w:sz w:val="19"/>
           <w:szCs w:val="19"/>
         </w:rPr>
-        <w:t xml:space="preserve">   Team ID:  </w:t>
       </w:r>
       <w:r>
         <w:rPr>
@@ -29659,7 +29642,6 @@
           <w:sz w:val="19"/>
           <w:szCs w:val="19"/>
         </w:rPr>
-        <w:tab/>
       </w:r>
     </w:p>
     <w:tbl>
@@ -31025,7 +31007,7 @@
           <w:sz w:val="19"/>
           <w:szCs w:val="19"/>
         </w:rPr>
-        <w:t xml:space="preserve">Project Title:  </w:t>
+        <w:t>Project Title:  DecoStone MMS     Team ID:  ____________________</w:t>
       </w:r>
       <w:r>
         <w:rPr>
@@ -31033,7 +31015,6 @@
           <w:sz w:val="19"/>
           <w:szCs w:val="19"/>
         </w:rPr>
-        <w:tab/>
       </w:r>
       <w:r>
         <w:rPr>
@@ -31043,7 +31024,6 @@
           <w:sz w:val="19"/>
           <w:szCs w:val="19"/>
         </w:rPr>
-        <w:t xml:space="preserve">   Team ID:  </w:t>
       </w:r>
       <w:r>
         <w:rPr>
@@ -31051,7 +31031,6 @@
           <w:sz w:val="19"/>
           <w:szCs w:val="19"/>
         </w:rPr>
-        <w:tab/>
       </w:r>
     </w:p>
     <w:tbl>
@@ -32417,7 +32396,7 @@
           <w:sz w:val="19"/>
           <w:szCs w:val="19"/>
         </w:rPr>
-        <w:t xml:space="preserve">Project Title:  </w:t>
+        <w:t>Project Title:  DecoStone MMS     Team ID:  ____________________</w:t>
       </w:r>
       <w:r>
         <w:rPr>
@@ -32425,7 +32404,6 @@
           <w:sz w:val="19"/>
           <w:szCs w:val="19"/>
         </w:rPr>
-        <w:tab/>
       </w:r>
       <w:r>
         <w:rPr>
@@ -32435,7 +32413,6 @@
           <w:sz w:val="19"/>
           <w:szCs w:val="19"/>
         </w:rPr>
-        <w:t xml:space="preserve">   Team ID:  </w:t>
       </w:r>
       <w:r>
         <w:rPr>
@@ -32443,7 +32420,6 @@
           <w:sz w:val="19"/>
           <w:szCs w:val="19"/>
         </w:rPr>
-        <w:tab/>
       </w:r>
     </w:p>
     <w:tbl>
@@ -33809,7 +33785,7 @@
           <w:sz w:val="19"/>
           <w:szCs w:val="19"/>
         </w:rPr>
-        <w:t xml:space="preserve">Project Title:  </w:t>
+        <w:t>Project Title:  DecoStone MMS     Team ID:  ____________________</w:t>
       </w:r>
       <w:r>
         <w:rPr>
@@ -33817,7 +33793,6 @@
           <w:sz w:val="19"/>
           <w:szCs w:val="19"/>
         </w:rPr>
-        <w:tab/>
       </w:r>
       <w:r>
         <w:rPr>
@@ -33827,7 +33802,6 @@
           <w:sz w:val="19"/>
           <w:szCs w:val="19"/>
         </w:rPr>
-        <w:t xml:space="preserve">   Team ID:  </w:t>
       </w:r>
       <w:r>
         <w:rPr>
@@ -33835,7 +33809,6 @@
           <w:sz w:val="19"/>
           <w:szCs w:val="19"/>
         </w:rPr>
-        <w:tab/>
       </w:r>
     </w:p>
     <w:tbl>
@@ -35201,7 +35174,7 @@
           <w:sz w:val="19"/>
           <w:szCs w:val="19"/>
         </w:rPr>
-        <w:t xml:space="preserve">Project Title:  </w:t>
+        <w:t>Project Title:  DecoStone MMS     Team ID:  ____________________</w:t>
       </w:r>
       <w:r>
         <w:rPr>
@@ -35209,7 +35182,6 @@
           <w:sz w:val="19"/>
           <w:szCs w:val="19"/>
         </w:rPr>
-        <w:tab/>
       </w:r>
       <w:r>
         <w:rPr>
@@ -35219,7 +35191,6 @@
           <w:sz w:val="19"/>
           <w:szCs w:val="19"/>
         </w:rPr>
-        <w:t xml:space="preserve">   Team ID:  </w:t>
       </w:r>
       <w:r>
         <w:rPr>
@@ -35227,7 +35198,6 @@
           <w:sz w:val="19"/>
           <w:szCs w:val="19"/>
         </w:rPr>
-        <w:tab/>
       </w:r>
     </w:p>
     <w:tbl>
@@ -36593,7 +36563,7 @@
           <w:sz w:val="19"/>
           <w:szCs w:val="19"/>
         </w:rPr>
-        <w:t xml:space="preserve">Project Title:  </w:t>
+        <w:t>Project Title:  DecoStone MMS     Team ID:  ____________________</w:t>
       </w:r>
       <w:r>
         <w:rPr>
@@ -36601,7 +36571,6 @@
           <w:sz w:val="19"/>
           <w:szCs w:val="19"/>
         </w:rPr>
-        <w:tab/>
       </w:r>
       <w:r>
         <w:rPr>
@@ -36611,7 +36580,6 @@
           <w:sz w:val="19"/>
           <w:szCs w:val="19"/>
         </w:rPr>
-        <w:t xml:space="preserve">   Team ID:  </w:t>
       </w:r>
       <w:r>
         <w:rPr>
@@ -36619,7 +36587,6 @@
           <w:sz w:val="19"/>
           <w:szCs w:val="19"/>
         </w:rPr>
-        <w:tab/>
       </w:r>
     </w:p>
     <w:tbl>
@@ -37985,7 +37952,7 @@
           <w:sz w:val="19"/>
           <w:szCs w:val="19"/>
         </w:rPr>
-        <w:t xml:space="preserve">Project Title:  </w:t>
+        <w:t>Project Title:  DecoStone MMS     Team ID:  ____________________</w:t>
       </w:r>
       <w:r>
         <w:rPr>
@@ -37993,7 +37960,6 @@
           <w:sz w:val="19"/>
           <w:szCs w:val="19"/>
         </w:rPr>
-        <w:tab/>
       </w:r>
       <w:r>
         <w:rPr>
@@ -38003,7 +37969,6 @@
           <w:sz w:val="19"/>
           <w:szCs w:val="19"/>
         </w:rPr>
-        <w:t xml:space="preserve">   Team ID:  </w:t>
       </w:r>
       <w:r>
         <w:rPr>
@@ -38011,7 +37976,6 @@
           <w:sz w:val="19"/>
           <w:szCs w:val="19"/>
         </w:rPr>
-        <w:tab/>
       </w:r>
     </w:p>
     <w:tbl>
@@ -39379,7 +39343,7 @@
           <w:sz w:val="19"/>
           <w:szCs w:val="19"/>
         </w:rPr>
-        <w:t xml:space="preserve">Project Title:  </w:t>
+        <w:t>Project Title:  DecoStone MMS     Team ID:  ____________________</w:t>
       </w:r>
       <w:r>
         <w:rPr>
@@ -39387,7 +39351,6 @@
           <w:sz w:val="19"/>
           <w:szCs w:val="19"/>
         </w:rPr>
-        <w:tab/>
       </w:r>
       <w:r>
         <w:rPr>
@@ -39397,7 +39360,6 @@
           <w:sz w:val="19"/>
           <w:szCs w:val="19"/>
         </w:rPr>
-        <w:t xml:space="preserve">   Team ID:  </w:t>
       </w:r>
       <w:r>
         <w:rPr>
@@ -39405,7 +39367,6 @@
           <w:sz w:val="19"/>
           <w:szCs w:val="19"/>
         </w:rPr>
-        <w:tab/>
       </w:r>
     </w:p>
     <w:tbl>
@@ -41517,7 +41478,7 @@
           <w:sz w:val="19"/>
           <w:szCs w:val="19"/>
         </w:rPr>
-        <w:t xml:space="preserve">Project Title:  </w:t>
+        <w:t>Project Title:  DecoStone MMS     Team ID:  ____________________</w:t>
       </w:r>
       <w:r>
         <w:rPr>
@@ -41525,7 +41486,6 @@
           <w:sz w:val="19"/>
           <w:szCs w:val="19"/>
         </w:rPr>
-        <w:tab/>
       </w:r>
       <w:r>
         <w:rPr>
@@ -41535,7 +41495,6 @@
           <w:sz w:val="19"/>
           <w:szCs w:val="19"/>
         </w:rPr>
-        <w:t xml:space="preserve">   Team ID:  </w:t>
       </w:r>
       <w:r>
         <w:rPr>
@@ -41543,7 +41502,6 @@
           <w:sz w:val="19"/>
           <w:szCs w:val="19"/>
         </w:rPr>
-        <w:tab/>
       </w:r>
     </w:p>
     <w:tbl>
@@ -43511,7 +43469,7 @@
                 <w:b w:val="0"/>
                 <w:sz w:val="14"/>
               </w:rPr>
-              <w:t>React / Express / SQLite / SQL</w:t>
+              <w:t>React / CSS / Express / Node.js</w:t>
             </w:r>
           </w:p>
         </w:tc>
@@ -43706,7 +43664,7 @@
                 <w:b w:val="0"/>
                 <w:sz w:val="14"/>
               </w:rPr>
-              <w:t>React / Express / SQLite / SQL</w:t>
+              <w:t>React / CSS / Express / Node.js</w:t>
             </w:r>
           </w:p>
         </w:tc>
@@ -43901,7 +43859,7 @@
                 <w:b w:val="0"/>
                 <w:sz w:val="14"/>
               </w:rPr>
-              <w:t>React / Express / SQLite / SQL</w:t>
+              <w:t>SQLite / SQL / better-sqlite3</w:t>
             </w:r>
           </w:p>
         </w:tc>
@@ -44096,7 +44054,7 @@
                 <w:b w:val="0"/>
                 <w:sz w:val="14"/>
               </w:rPr>
-              <w:t>React / Express / SQLite / SQL</w:t>
+              <w:t>SQLite / SQL / better-sqlite3</w:t>
             </w:r>
           </w:p>
         </w:tc>
@@ -44617,7 +44575,7 @@
                 <w:b w:val="0"/>
                 <w:sz w:val="14"/>
               </w:rPr>
-              <w:t>React / Express / SQLite / SQL</w:t>
+              <w:t>React / CSS / Express / Node.js</w:t>
             </w:r>
           </w:p>
         </w:tc>
@@ -44812,7 +44770,7 @@
                 <w:b w:val="0"/>
                 <w:sz w:val="14"/>
               </w:rPr>
-              <w:t>React / Express / SQLite / SQL</w:t>
+              <w:t>React / CSS / Express / Node.js</w:t>
             </w:r>
           </w:p>
         </w:tc>
@@ -45007,7 +44965,7 @@
                 <w:b w:val="0"/>
                 <w:sz w:val="14"/>
               </w:rPr>
-              <w:t>React / Express / SQLite / SQL</w:t>
+              <w:t>SQLite / SQL / better-sqlite3</w:t>
             </w:r>
           </w:p>
         </w:tc>
@@ -45202,7 +45160,7 @@
                 <w:b w:val="0"/>
                 <w:sz w:val="14"/>
               </w:rPr>
-              <w:t>React / Express / SQLite / SQL</w:t>
+              <w:t>SQLite / SQL / better-sqlite3</w:t>
             </w:r>
           </w:p>
         </w:tc>
@@ -45290,7 +45248,7 @@
           <w:sz w:val="19"/>
           <w:szCs w:val="19"/>
         </w:rPr>
-        <w:t xml:space="preserve">Project Title:  </w:t>
+        <w:t>Project Title:  DecoStone MMS     Team ID:  ____________________</w:t>
       </w:r>
       <w:r>
         <w:rPr>
@@ -45298,7 +45256,6 @@
           <w:sz w:val="19"/>
           <w:szCs w:val="19"/>
         </w:rPr>
-        <w:tab/>
       </w:r>
       <w:r>
         <w:rPr>
@@ -45308,7 +45265,6 @@
           <w:sz w:val="19"/>
           <w:szCs w:val="19"/>
         </w:rPr>
-        <w:t xml:space="preserve">   Team ID:  </w:t>
       </w:r>
       <w:r>
         <w:rPr>
@@ -45316,7 +45272,6 @@
           <w:sz w:val="19"/>
           <w:szCs w:val="19"/>
         </w:rPr>
-        <w:tab/>
       </w:r>
     </w:p>
     <w:tbl>
@@ -47834,7 +47789,7 @@
           <w:sz w:val="19"/>
           <w:szCs w:val="19"/>
         </w:rPr>
-        <w:t xml:space="preserve">Project Title:  </w:t>
+        <w:t>Project Title:  DecoStone MMS     Team ID:  ____________________</w:t>
       </w:r>
       <w:r>
         <w:rPr>
@@ -47842,7 +47797,6 @@
           <w:sz w:val="19"/>
           <w:szCs w:val="19"/>
         </w:rPr>
-        <w:tab/>
       </w:r>
       <w:r>
         <w:rPr>
@@ -47852,7 +47806,6 @@
           <w:sz w:val="19"/>
           <w:szCs w:val="19"/>
         </w:rPr>
-        <w:t xml:space="preserve">   Team ID:  </w:t>
       </w:r>
       <w:r>
         <w:rPr>
@@ -47860,7 +47813,6 @@
           <w:sz w:val="19"/>
           <w:szCs w:val="19"/>
         </w:rPr>
-        <w:tab/>
       </w:r>
     </w:p>
     <w:tbl>

</xml_diff>